<commit_message>
Az5 first part completed
</commit_message>
<xml_diff>
--- a/E5/Az5.docx
+++ b/E5/Az5.docx
@@ -65,7 +65,23 @@
           <w:rtl/>
           <w:lang w:bidi="fa-IR"/>
         </w:rPr>
-        <w:t xml:space="preserve">آشنایی با تراشه </w:t>
+        <w:t>آ</w:t>
+      </w:r>
+      <w:r>
+        <w:rPr>
+          <w:rFonts w:ascii="Calibri" w:hAnsi="Calibri" w:cs="Calibri" w:hint="cs"/>
+          <w:rtl/>
+          <w:lang w:bidi="fa-IR"/>
+        </w:rPr>
+        <w:t xml:space="preserve">  </w:t>
+      </w:r>
+      <w:r>
+        <w:rPr>
+          <w:rFonts w:ascii="Calibri" w:hAnsi="Calibri" w:cs="Calibri"/>
+          <w:rtl/>
+          <w:lang w:bidi="fa-IR"/>
+        </w:rPr>
+        <w:t xml:space="preserve">شنایی با تراشه </w:t>
       </w:r>
       <w:r>
         <w:rPr>
@@ -801,63 +817,6 @@
       <w:r>
         <w:rPr>
           <w:rFonts w:ascii="Calibri" w:eastAsiaTheme="minorEastAsia" w:hAnsi="Calibri" w:cs="Calibri"/>
-          <w:noProof/>
-          <w:rtl/>
-          <w:lang w:bidi="fa-IR"/>
-        </w:rPr>
-        <w:drawing>
-          <wp:anchor distT="0" distB="0" distL="114300" distR="114300" simplePos="0" relativeHeight="251658240" behindDoc="0" locked="0" layoutInCell="1" allowOverlap="1" wp14:anchorId="755DE8E3" wp14:editId="5F6BAB71">
-            <wp:simplePos x="0" y="0"/>
-            <wp:positionH relativeFrom="column">
-              <wp:posOffset>34724</wp:posOffset>
-            </wp:positionH>
-            <wp:positionV relativeFrom="paragraph">
-              <wp:posOffset>682890</wp:posOffset>
-            </wp:positionV>
-            <wp:extent cx="5943600" cy="3282950"/>
-            <wp:effectExtent l="0" t="0" r="0" b="0"/>
-            <wp:wrapSquare wrapText="bothSides"/>
-            <wp:docPr id="589106318" name="Picture 1"/>
-            <wp:cNvGraphicFramePr>
-              <a:graphicFrameLocks xmlns:a="http://schemas.openxmlformats.org/drawingml/2006/main" noChangeAspect="1"/>
-            </wp:cNvGraphicFramePr>
-            <a:graphic xmlns:a="http://schemas.openxmlformats.org/drawingml/2006/main">
-              <a:graphicData uri="http://schemas.openxmlformats.org/drawingml/2006/picture">
-                <pic:pic xmlns:pic="http://schemas.openxmlformats.org/drawingml/2006/picture">
-                  <pic:nvPicPr>
-                    <pic:cNvPr id="589106318" name=""/>
-                    <pic:cNvPicPr/>
-                  </pic:nvPicPr>
-                  <pic:blipFill>
-                    <a:blip r:embed="rId7">
-                      <a:extLst>
-                        <a:ext uri="{28A0092B-C50C-407E-A947-70E740481C1C}">
-                          <a14:useLocalDpi xmlns:a14="http://schemas.microsoft.com/office/drawing/2010/main" val="0"/>
-                        </a:ext>
-                      </a:extLst>
-                    </a:blip>
-                    <a:stretch>
-                      <a:fillRect/>
-                    </a:stretch>
-                  </pic:blipFill>
-                  <pic:spPr>
-                    <a:xfrm>
-                      <a:off x="0" y="0"/>
-                      <a:ext cx="5943600" cy="3282950"/>
-                    </a:xfrm>
-                    <a:prstGeom prst="rect">
-                      <a:avLst/>
-                    </a:prstGeom>
-                  </pic:spPr>
-                </pic:pic>
-              </a:graphicData>
-            </a:graphic>
-          </wp:anchor>
-        </w:drawing>
-      </w:r>
-      <w:r>
-        <w:rPr>
-          <w:rFonts w:ascii="Calibri" w:eastAsiaTheme="minorEastAsia" w:hAnsi="Calibri" w:cs="Calibri"/>
           <w:rtl/>
           <w:lang w:bidi="fa-IR"/>
         </w:rPr>
@@ -1188,6 +1147,70 @@
           <w:lang w:bidi="fa-IR"/>
         </w:rPr>
       </w:pPr>
+      <w:r>
+        <w:rPr>
+          <w:rFonts w:ascii="Calibri" w:eastAsiaTheme="minorEastAsia" w:hAnsi="Calibri" w:cs="Calibri"/>
+          <w:rtl/>
+          <w:lang w:bidi="fa-IR"/>
+        </w:rPr>
+        <w:drawing>
+          <wp:inline distT="0" distB="0" distL="0" distR="0" wp14:anchorId="6CE3D982" wp14:editId="11D54D59">
+            <wp:extent cx="5943600" cy="3354070"/>
+            <wp:effectExtent l="0" t="0" r="0" b="0"/>
+            <wp:docPr id="1220821479" name="Picture 1"/>
+            <wp:cNvGraphicFramePr>
+              <a:graphicFrameLocks xmlns:a="http://schemas.openxmlformats.org/drawingml/2006/main" noChangeAspect="1"/>
+            </wp:cNvGraphicFramePr>
+            <a:graphic xmlns:a="http://schemas.openxmlformats.org/drawingml/2006/main">
+              <a:graphicData uri="http://schemas.openxmlformats.org/drawingml/2006/picture">
+                <pic:pic xmlns:pic="http://schemas.openxmlformats.org/drawingml/2006/picture">
+                  <pic:nvPicPr>
+                    <pic:cNvPr id="1220821479" name=""/>
+                    <pic:cNvPicPr/>
+                  </pic:nvPicPr>
+                  <pic:blipFill>
+                    <a:blip r:embed="rId7"/>
+                    <a:stretch>
+                      <a:fillRect/>
+                    </a:stretch>
+                  </pic:blipFill>
+                  <pic:spPr>
+                    <a:xfrm>
+                      <a:off x="0" y="0"/>
+                      <a:ext cx="5943600" cy="3354070"/>
+                    </a:xfrm>
+                    <a:prstGeom prst="rect">
+                      <a:avLst/>
+                    </a:prstGeom>
+                  </pic:spPr>
+                </pic:pic>
+              </a:graphicData>
+            </a:graphic>
+          </wp:inline>
+        </w:drawing>
+      </w:r>
+    </w:p>
+    <w:p>
+      <w:pPr>
+        <w:bidi/>
+        <w:spacing w:line="240" w:lineRule="auto"/>
+        <w:rPr>
+          <w:rFonts w:ascii="Calibri" w:eastAsiaTheme="minorEastAsia" w:hAnsi="Calibri" w:cs="Calibri"/>
+          <w:rtl/>
+          <w:lang w:bidi="fa-IR"/>
+        </w:rPr>
+      </w:pPr>
+    </w:p>
+    <w:p>
+      <w:pPr>
+        <w:bidi/>
+        <w:spacing w:line="240" w:lineRule="auto"/>
+        <w:rPr>
+          <w:rFonts w:ascii="Calibri" w:eastAsiaTheme="minorEastAsia" w:hAnsi="Calibri" w:cs="Calibri"/>
+          <w:rtl/>
+          <w:lang w:bidi="fa-IR"/>
+        </w:rPr>
+      </w:pPr>
     </w:p>
     <w:p>
       <w:pPr>
@@ -1208,7 +1231,6 @@
           <w:rFonts w:ascii="Calibri" w:eastAsiaTheme="minorEastAsia" w:hAnsi="Calibri" w:cs="Calibri"/>
           <w:lang w:bidi="fa-IR"/>
         </w:rPr>
-        <w:lastRenderedPageBreak/>
         <w:t>Multiplexer</w:t>
       </w:r>
       <w:r>
@@ -2819,7 +2841,6 @@
           <w:rtl/>
           <w:lang w:bidi="fa-IR"/>
         </w:rPr>
-        <w:lastRenderedPageBreak/>
         <w:t>جدول خواسته شده ی آزمایش:</w:t>
       </w:r>
     </w:p>
@@ -8524,6 +8545,7 @@
       <w:r>
         <w:rPr>
           <w:rFonts w:ascii="Calibri" w:hAnsi="Calibri" w:cs="Calibri"/>
+          <w:noProof/>
           <w:rtl/>
           <w:lang w:bidi="fa-IR"/>
         </w:rPr>
@@ -8625,7 +8647,6 @@
           <w:rtl/>
           <w:lang w:bidi="fa-IR"/>
         </w:rPr>
-        <w:lastRenderedPageBreak/>
         <w:t>تست مدار:</w:t>
       </w:r>
     </w:p>
@@ -8664,11 +8685,12 @@
       <w:r>
         <w:rPr>
           <w:rFonts w:ascii="Calibri" w:eastAsiaTheme="majorEastAsia" w:hAnsi="Calibri" w:cs="Calibri"/>
+          <w:noProof/>
           <w:rtl/>
           <w:lang w:bidi="fa-IR"/>
         </w:rPr>
         <w:drawing>
-          <wp:anchor distT="0" distB="0" distL="114300" distR="114300" simplePos="0" relativeHeight="251667456" behindDoc="0" locked="0" layoutInCell="1" allowOverlap="1" wp14:anchorId="449970B3" wp14:editId="06938B20">
+          <wp:anchor distT="0" distB="0" distL="114300" distR="114300" simplePos="0" relativeHeight="251667456" behindDoc="0" locked="0" layoutInCell="1" allowOverlap="1" wp14:anchorId="449970B3" wp14:editId="25630CEE">
             <wp:simplePos x="0" y="0"/>
             <wp:positionH relativeFrom="margin">
               <wp:align>right</wp:align>
@@ -8867,11 +8889,12 @@
       <w:r>
         <w:rPr>
           <w:rFonts w:ascii="Calibri" w:eastAsiaTheme="majorEastAsia" w:hAnsi="Calibri" w:cs="Calibri"/>
+          <w:noProof/>
           <w:rtl/>
           <w:lang w:bidi="fa-IR"/>
         </w:rPr>
         <w:drawing>
-          <wp:anchor distT="0" distB="0" distL="114300" distR="114300" simplePos="0" relativeHeight="251668480" behindDoc="0" locked="0" layoutInCell="1" allowOverlap="1" wp14:anchorId="3B3F2865" wp14:editId="0DBC2992">
+          <wp:anchor distT="0" distB="0" distL="114300" distR="114300" simplePos="0" relativeHeight="251668480" behindDoc="0" locked="0" layoutInCell="1" allowOverlap="1" wp14:anchorId="3B3F2865" wp14:editId="48775775">
             <wp:simplePos x="0" y="0"/>
             <wp:positionH relativeFrom="margin">
               <wp:align>right</wp:align>
@@ -9187,6 +9210,7 @@
       <w:r>
         <w:rPr>
           <w:rFonts w:ascii="Calibri" w:eastAsiaTheme="majorEastAsia" w:hAnsi="Calibri" w:cs="Calibri"/>
+          <w:noProof/>
           <w:rtl/>
           <w:lang w:bidi="fa-IR"/>
         </w:rPr>
@@ -9275,138 +9299,19 @@
       </w:pPr>
       <w:r>
         <w:rPr>
-          <w:rFonts w:ascii="Calibri" w:eastAsiaTheme="majorEastAsia" w:hAnsi="Calibri" w:cs="Calibri" w:hint="cs"/>
-          <w:sz w:val="22"/>
-          <w:szCs w:val="22"/>
-          <w:rtl/>
-          <w:lang w:bidi="fa-IR"/>
-        </w:rPr>
-        <w:t xml:space="preserve">عملیات در این مرحله لود کردن </w:t>
-      </w:r>
-      <w:r>
-        <w:rPr>
           <w:rFonts w:ascii="Calibri" w:eastAsiaTheme="majorEastAsia" w:hAnsi="Calibri" w:cs="Calibri"/>
-          <w:sz w:val="22"/>
-          <w:szCs w:val="22"/>
-          <w:lang w:bidi="fa-IR"/>
-        </w:rPr>
-        <w:t>B</w:t>
-      </w:r>
-      <w:r>
-        <w:rPr>
-          <w:rFonts w:ascii="Calibri" w:eastAsiaTheme="majorEastAsia" w:hAnsi="Calibri" w:cs="Calibri" w:hint="cs"/>
-          <w:sz w:val="22"/>
-          <w:szCs w:val="22"/>
-          <w:rtl/>
-          <w:lang w:bidi="fa-IR"/>
-        </w:rPr>
-        <w:t xml:space="preserve"> در </w:t>
-      </w:r>
-      <w:r>
-        <w:rPr>
-          <w:rFonts w:ascii="Calibri" w:eastAsiaTheme="majorEastAsia" w:hAnsi="Calibri" w:cs="Calibri"/>
-          <w:sz w:val="22"/>
-          <w:szCs w:val="22"/>
-          <w:lang w:bidi="fa-IR"/>
-        </w:rPr>
-        <w:t>A</w:t>
-      </w:r>
-      <w:r>
-        <w:rPr>
-          <w:rFonts w:ascii="Calibri" w:eastAsiaTheme="majorEastAsia" w:hAnsi="Calibri" w:cs="Calibri" w:hint="cs"/>
-          <w:sz w:val="22"/>
-          <w:szCs w:val="22"/>
-          <w:rtl/>
-          <w:lang w:bidi="fa-IR"/>
-        </w:rPr>
-        <w:t xml:space="preserve"> است: (در شکل زیر قبل از زدن کلاک واضح است که </w:t>
-      </w:r>
-      <w:r>
-        <w:rPr>
-          <w:rFonts w:ascii="Calibri" w:eastAsiaTheme="majorEastAsia" w:hAnsi="Calibri" w:cs="Calibri" w:hint="cs"/>
-          <w:sz w:val="22"/>
-          <w:szCs w:val="22"/>
-          <w:rtl/>
-          <w:lang w:bidi="fa-IR"/>
-        </w:rPr>
-        <w:t xml:space="preserve">3  </w:t>
-      </w:r>
-      <w:r>
-        <w:rPr>
-          <w:rFonts w:ascii="Calibri" w:eastAsiaTheme="majorEastAsia" w:hAnsi="Calibri" w:cs="Calibri" w:hint="cs"/>
-          <w:sz w:val="22"/>
-          <w:szCs w:val="22"/>
-          <w:rtl/>
-          <w:lang w:bidi="fa-IR"/>
-        </w:rPr>
-        <w:t xml:space="preserve"> پشت رجیستر </w:t>
-      </w:r>
-      <w:r>
-        <w:rPr>
-          <w:rFonts w:ascii="Calibri" w:eastAsiaTheme="majorEastAsia" w:hAnsi="Calibri" w:cs="Calibri"/>
-          <w:sz w:val="22"/>
-          <w:szCs w:val="22"/>
-          <w:lang w:bidi="fa-IR"/>
-        </w:rPr>
-        <w:t xml:space="preserve">A </w:t>
-      </w:r>
-      <w:r>
-        <w:rPr>
-          <w:rFonts w:ascii="Calibri" w:eastAsiaTheme="majorEastAsia" w:hAnsi="Calibri" w:cs="Calibri" w:hint="cs"/>
-          <w:sz w:val="22"/>
-          <w:szCs w:val="22"/>
-          <w:rtl/>
-          <w:lang w:bidi="fa-IR"/>
-        </w:rPr>
-        <w:t>لود شده است)</w:t>
-      </w:r>
-    </w:p>
-    <w:p>
-      <w:pPr>
-        <w:pStyle w:val="ListParagraph"/>
-        <w:bidi/>
-        <w:rPr>
-          <w:rFonts w:ascii="Calibri" w:eastAsiaTheme="majorEastAsia" w:hAnsi="Calibri" w:cs="Calibri"/>
-          <w:rtl/>
-          <w:lang w:bidi="fa-IR"/>
-        </w:rPr>
-      </w:pPr>
-    </w:p>
-    <w:p>
-      <w:pPr>
-        <w:pStyle w:val="ListParagraph"/>
-        <w:bidi/>
-        <w:rPr>
-          <w:rFonts w:ascii="Calibri" w:eastAsiaTheme="majorEastAsia" w:hAnsi="Calibri" w:cs="Calibri"/>
-          <w:rtl/>
-          <w:lang w:bidi="fa-IR"/>
-        </w:rPr>
-      </w:pPr>
-    </w:p>
-    <w:p>
-      <w:pPr>
-        <w:pStyle w:val="ListParagraph"/>
-        <w:bidi/>
-        <w:rPr>
-          <w:rFonts w:ascii="Calibri" w:eastAsiaTheme="majorEastAsia" w:hAnsi="Calibri" w:cs="Calibri"/>
-          <w:rtl/>
-          <w:lang w:bidi="fa-IR"/>
-        </w:rPr>
-      </w:pPr>
-      <w:r>
-        <w:rPr>
-          <w:rFonts w:ascii="Calibri" w:eastAsiaTheme="majorEastAsia" w:hAnsi="Calibri" w:cs="Calibri"/>
+          <w:noProof/>
           <w:rtl/>
           <w:lang w:bidi="fa-IR"/>
         </w:rPr>
         <w:drawing>
-          <wp:anchor distT="0" distB="0" distL="114300" distR="114300" simplePos="0" relativeHeight="251669504" behindDoc="0" locked="0" layoutInCell="1" allowOverlap="1" wp14:anchorId="50C11E8B" wp14:editId="3A70A023">
+          <wp:anchor distT="0" distB="0" distL="114300" distR="114300" simplePos="0" relativeHeight="251669504" behindDoc="0" locked="0" layoutInCell="1" allowOverlap="1" wp14:anchorId="50C11E8B" wp14:editId="3B7E80DF">
             <wp:simplePos x="0" y="0"/>
-            <wp:positionH relativeFrom="column">
-              <wp:posOffset>-457200</wp:posOffset>
+            <wp:positionH relativeFrom="margin">
+              <wp:align>right</wp:align>
             </wp:positionH>
             <wp:positionV relativeFrom="paragraph">
-              <wp:posOffset>3463</wp:posOffset>
+              <wp:posOffset>603829</wp:posOffset>
             </wp:positionV>
             <wp:extent cx="5943600" cy="2665730"/>
             <wp:effectExtent l="0" t="0" r="0" b="1270"/>
@@ -9449,6 +9354,126 @@
           </wp:anchor>
         </w:drawing>
       </w:r>
+      <w:r>
+        <w:rPr>
+          <w:rFonts w:ascii="Calibri" w:eastAsiaTheme="majorEastAsia" w:hAnsi="Calibri" w:cs="Calibri" w:hint="cs"/>
+          <w:sz w:val="22"/>
+          <w:szCs w:val="22"/>
+          <w:rtl/>
+          <w:lang w:bidi="fa-IR"/>
+        </w:rPr>
+        <w:t xml:space="preserve">عملیات در این مرحله لود کردن </w:t>
+      </w:r>
+      <w:r>
+        <w:rPr>
+          <w:rFonts w:ascii="Calibri" w:eastAsiaTheme="majorEastAsia" w:hAnsi="Calibri" w:cs="Calibri"/>
+          <w:sz w:val="22"/>
+          <w:szCs w:val="22"/>
+          <w:lang w:bidi="fa-IR"/>
+        </w:rPr>
+        <w:t>B</w:t>
+      </w:r>
+      <w:r>
+        <w:rPr>
+          <w:rFonts w:ascii="Calibri" w:eastAsiaTheme="majorEastAsia" w:hAnsi="Calibri" w:cs="Calibri" w:hint="cs"/>
+          <w:sz w:val="22"/>
+          <w:szCs w:val="22"/>
+          <w:rtl/>
+          <w:lang w:bidi="fa-IR"/>
+        </w:rPr>
+        <w:t xml:space="preserve"> در </w:t>
+      </w:r>
+      <w:r>
+        <w:rPr>
+          <w:rFonts w:ascii="Calibri" w:eastAsiaTheme="majorEastAsia" w:hAnsi="Calibri" w:cs="Calibri"/>
+          <w:sz w:val="22"/>
+          <w:szCs w:val="22"/>
+          <w:lang w:bidi="fa-IR"/>
+        </w:rPr>
+        <w:t>A</w:t>
+      </w:r>
+      <w:r>
+        <w:rPr>
+          <w:rFonts w:ascii="Calibri" w:eastAsiaTheme="majorEastAsia" w:hAnsi="Calibri" w:cs="Calibri" w:hint="cs"/>
+          <w:sz w:val="22"/>
+          <w:szCs w:val="22"/>
+          <w:rtl/>
+          <w:lang w:bidi="fa-IR"/>
+        </w:rPr>
+        <w:t xml:space="preserve"> است: (در شکل زیر قبل از زدن کلاک واضح است که </w:t>
+      </w:r>
+      <w:r>
+        <w:rPr>
+          <w:rFonts w:ascii="Calibri" w:eastAsiaTheme="majorEastAsia" w:hAnsi="Calibri" w:cs="Calibri" w:hint="cs"/>
+          <w:sz w:val="22"/>
+          <w:szCs w:val="22"/>
+          <w:rtl/>
+          <w:lang w:bidi="fa-IR"/>
+        </w:rPr>
+        <w:t xml:space="preserve">3  </w:t>
+      </w:r>
+      <w:r>
+        <w:rPr>
+          <w:rFonts w:ascii="Calibri" w:eastAsiaTheme="majorEastAsia" w:hAnsi="Calibri" w:cs="Calibri" w:hint="cs"/>
+          <w:sz w:val="22"/>
+          <w:szCs w:val="22"/>
+          <w:rtl/>
+          <w:lang w:bidi="fa-IR"/>
+        </w:rPr>
+        <w:t xml:space="preserve"> پشت رجیستر </w:t>
+      </w:r>
+      <w:r>
+        <w:rPr>
+          <w:rFonts w:ascii="Calibri" w:eastAsiaTheme="majorEastAsia" w:hAnsi="Calibri" w:cs="Calibri"/>
+          <w:sz w:val="22"/>
+          <w:szCs w:val="22"/>
+          <w:lang w:bidi="fa-IR"/>
+        </w:rPr>
+        <w:t xml:space="preserve">A </w:t>
+      </w:r>
+      <w:r>
+        <w:rPr>
+          <w:rFonts w:ascii="Calibri" w:eastAsiaTheme="majorEastAsia" w:hAnsi="Calibri" w:cs="Calibri" w:hint="cs"/>
+          <w:sz w:val="22"/>
+          <w:szCs w:val="22"/>
+          <w:rtl/>
+          <w:lang w:bidi="fa-IR"/>
+        </w:rPr>
+        <w:t>لود شده است)</w:t>
+      </w:r>
+    </w:p>
+    <w:p>
+      <w:pPr>
+        <w:pStyle w:val="ListParagraph"/>
+        <w:bidi/>
+        <w:rPr>
+          <w:rFonts w:ascii="Calibri" w:eastAsiaTheme="majorEastAsia" w:hAnsi="Calibri" w:cs="Calibri"/>
+          <w:rtl/>
+          <w:lang w:bidi="fa-IR"/>
+        </w:rPr>
+      </w:pPr>
+    </w:p>
+    <w:p>
+      <w:pPr>
+        <w:pStyle w:val="ListParagraph"/>
+        <w:bidi/>
+        <w:rPr>
+          <w:rFonts w:ascii="Calibri" w:eastAsiaTheme="majorEastAsia" w:hAnsi="Calibri" w:cs="Calibri"/>
+          <w:rtl/>
+          <w:lang w:bidi="fa-IR"/>
+        </w:rPr>
+      </w:pPr>
+    </w:p>
+    <w:p>
+      <w:pPr>
+        <w:pStyle w:val="ListParagraph"/>
+        <w:bidi/>
+        <w:rPr>
+          <w:rFonts w:ascii="Calibri" w:eastAsiaTheme="majorEastAsia" w:hAnsi="Calibri" w:cs="Calibri"/>
+          <w:rtl/>
+          <w:lang w:bidi="fa-IR"/>
+        </w:rPr>
+      </w:pPr>
     </w:p>
     <w:p>
       <w:pPr>
@@ -9469,7 +9494,6 @@
             <w:rFonts w:ascii="Cambria Math" w:eastAsiaTheme="majorEastAsia" w:hAnsi="Cambria Math" w:cs="Calibri"/>
             <w:lang w:bidi="fa-IR"/>
           </w:rPr>
-          <w:lastRenderedPageBreak/>
           <m:t>M=100</m:t>
         </m:r>
       </m:oMath>
@@ -9514,12 +9538,14 @@
         <w:bidi/>
         <w:rPr>
           <w:rFonts w:ascii="Calibri" w:eastAsiaTheme="majorEastAsia" w:hAnsi="Calibri" w:cs="Calibri"/>
+          <w:rtl/>
           <w:lang w:bidi="fa-IR"/>
         </w:rPr>
       </w:pPr>
       <w:r>
         <w:rPr>
           <w:rFonts w:ascii="Calibri" w:eastAsiaTheme="majorEastAsia" w:hAnsi="Calibri" w:cs="Calibri"/>
+          <w:noProof/>
           <w:rtl/>
           <w:lang w:bidi="fa-IR"/>
         </w:rPr>
@@ -9571,6 +9597,38 @@
     <w:p>
       <w:pPr>
         <w:pStyle w:val="ListParagraph"/>
+        <w:bidi/>
+        <w:rPr>
+          <w:rFonts w:ascii="Calibri" w:eastAsiaTheme="majorEastAsia" w:hAnsi="Calibri" w:cs="Calibri"/>
+          <w:rtl/>
+          <w:lang w:bidi="fa-IR"/>
+        </w:rPr>
+      </w:pPr>
+    </w:p>
+    <w:p>
+      <w:pPr>
+        <w:pStyle w:val="ListParagraph"/>
+        <w:bidi/>
+        <w:rPr>
+          <w:rFonts w:ascii="Calibri" w:eastAsiaTheme="majorEastAsia" w:hAnsi="Calibri" w:cs="Calibri"/>
+          <w:rtl/>
+          <w:lang w:bidi="fa-IR"/>
+        </w:rPr>
+      </w:pPr>
+    </w:p>
+    <w:p>
+      <w:pPr>
+        <w:pStyle w:val="ListParagraph"/>
+        <w:bidi/>
+        <w:rPr>
+          <w:rFonts w:ascii="Calibri" w:eastAsiaTheme="majorEastAsia" w:hAnsi="Calibri" w:cs="Calibri"/>
+          <w:lang w:bidi="fa-IR"/>
+        </w:rPr>
+      </w:pPr>
+    </w:p>
+    <w:p>
+      <w:pPr>
+        <w:pStyle w:val="ListParagraph"/>
         <w:numPr>
           <w:ilvl w:val="0"/>
           <w:numId w:val="4"/>
@@ -9649,6 +9707,7 @@
       <w:r>
         <w:rPr>
           <w:rFonts w:ascii="Calibri" w:eastAsiaTheme="majorEastAsia" w:hAnsi="Calibri" w:cs="Calibri"/>
+          <w:noProof/>
           <w:rtl/>
           <w:lang w:bidi="fa-IR"/>
         </w:rPr>
@@ -9703,60 +9762,6 @@
     <w:p>
       <w:pPr>
         <w:pStyle w:val="ListParagraph"/>
-        <w:bidi/>
-        <w:rPr>
-          <w:rFonts w:ascii="Calibri" w:eastAsiaTheme="majorEastAsia" w:hAnsi="Calibri" w:cs="Calibri"/>
-          <w:rtl/>
-          <w:lang w:bidi="fa-IR"/>
-        </w:rPr>
-      </w:pPr>
-    </w:p>
-    <w:p>
-      <w:pPr>
-        <w:pStyle w:val="ListParagraph"/>
-        <w:bidi/>
-        <w:rPr>
-          <w:rFonts w:ascii="Calibri" w:eastAsiaTheme="majorEastAsia" w:hAnsi="Calibri" w:cs="Calibri"/>
-          <w:rtl/>
-          <w:lang w:bidi="fa-IR"/>
-        </w:rPr>
-      </w:pPr>
-    </w:p>
-    <w:p>
-      <w:pPr>
-        <w:pStyle w:val="ListParagraph"/>
-        <w:bidi/>
-        <w:rPr>
-          <w:rFonts w:ascii="Calibri" w:eastAsiaTheme="majorEastAsia" w:hAnsi="Calibri" w:cs="Calibri"/>
-          <w:rtl/>
-          <w:lang w:bidi="fa-IR"/>
-        </w:rPr>
-      </w:pPr>
-    </w:p>
-    <w:p>
-      <w:pPr>
-        <w:pStyle w:val="ListParagraph"/>
-        <w:bidi/>
-        <w:rPr>
-          <w:rFonts w:ascii="Calibri" w:eastAsiaTheme="majorEastAsia" w:hAnsi="Calibri" w:cs="Calibri"/>
-          <w:rtl/>
-          <w:lang w:bidi="fa-IR"/>
-        </w:rPr>
-      </w:pPr>
-    </w:p>
-    <w:p>
-      <w:pPr>
-        <w:pStyle w:val="ListParagraph"/>
-        <w:bidi/>
-        <w:rPr>
-          <w:rFonts w:ascii="Calibri" w:eastAsiaTheme="majorEastAsia" w:hAnsi="Calibri" w:cs="Calibri"/>
-          <w:lang w:bidi="fa-IR"/>
-        </w:rPr>
-      </w:pPr>
-    </w:p>
-    <w:p>
-      <w:pPr>
-        <w:pStyle w:val="ListParagraph"/>
         <w:numPr>
           <w:ilvl w:val="0"/>
           <w:numId w:val="4"/>
@@ -9874,10 +9879,10 @@
           <w:lang w:bidi="fa-IR"/>
         </w:rPr>
         <w:drawing>
-          <wp:inline distT="0" distB="0" distL="0" distR="0" wp14:anchorId="12DFEF30" wp14:editId="780B9282">
-            <wp:extent cx="5943600" cy="2662555"/>
-            <wp:effectExtent l="0" t="0" r="0" b="4445"/>
-            <wp:docPr id="779072231" name="Picture 1"/>
+          <wp:inline distT="0" distB="0" distL="0" distR="0" wp14:anchorId="357C3EF2" wp14:editId="34C8AD36">
+            <wp:extent cx="5943600" cy="2496185"/>
+            <wp:effectExtent l="0" t="0" r="0" b="0"/>
+            <wp:docPr id="1341496848" name="Picture 1"/>
             <wp:cNvGraphicFramePr>
               <a:graphicFrameLocks xmlns:a="http://schemas.openxmlformats.org/drawingml/2006/main" noChangeAspect="1"/>
             </wp:cNvGraphicFramePr>
@@ -9885,7 +9890,7 @@
               <a:graphicData uri="http://schemas.openxmlformats.org/drawingml/2006/picture">
                 <pic:pic xmlns:pic="http://schemas.openxmlformats.org/drawingml/2006/picture">
                   <pic:nvPicPr>
-                    <pic:cNvPr id="779072231" name=""/>
+                    <pic:cNvPr id="1341496848" name=""/>
                     <pic:cNvPicPr/>
                   </pic:nvPicPr>
                   <pic:blipFill>
@@ -9897,7 +9902,7 @@
                   <pic:spPr>
                     <a:xfrm>
                       <a:off x="0" y="0"/>
-                      <a:ext cx="5943600" cy="2662555"/>
+                      <a:ext cx="5943600" cy="2496185"/>
                     </a:xfrm>
                     <a:prstGeom prst="rect">
                       <a:avLst/>
@@ -9915,7 +9920,7 @@
         <w:pStyle w:val="ListParagraph"/>
         <w:bidi/>
         <w:rPr>
-          <w:rFonts w:ascii="Calibri" w:eastAsiaTheme="majorEastAsia" w:hAnsi="Calibri" w:cs="Calibri" w:hint="cs"/>
+          <w:rFonts w:ascii="Calibri" w:eastAsiaTheme="majorEastAsia" w:hAnsi="Calibri" w:cs="Calibri"/>
           <w:rtl/>
           <w:lang w:bidi="fa-IR"/>
         </w:rPr>

</xml_diff>